<commit_message>
Recover evidence-backed reports instead of accepting empty analyses
</commit_message>
<xml_diff>
--- a/PROJECT_ARCHITECTURE.docx
+++ b/PROJECT_ARCHITECTURE.docx
@@ -1492,7 +1492,7 @@
         <w:pStyle w:val="ListNumber"/>
       </w:pPr>
       <w:r>
-        <w:t>Report identity is set from the queue. Website and source URLs not found exactly in the evidence are removed; source duplicates are removed.</w:t>
+        <w:t>Report identity is set from the queue. Source URLs absent from the evidence are removed, as are duplicate sources. A homepage is also accepted when a subpage on its exact origin was retrieved.</w:t>
       </w:r>
     </w:p>
     <w:p>
@@ -2557,7 +2557,7 @@
               <w:rPr>
                 <w:sz w:val="19"/>
               </w:rPr>
-              <w:t>Enforce queue identity and exact evidence-URL membership</w:t>
+              <w:t>Enforce queue identity; verify citations and homepage origins</w:t>
             </w:r>
           </w:p>
         </w:tc>
@@ -2992,7 +2992,7 @@
         <w:pStyle w:val="ListBullet"/>
       </w:pPr>
       <w:r>
-        <w:t>LLM SDK retries selected transient failures. Discovery and analysis each regenerate once from the original evidence if output is empty, malformed, or fails validation. Text-block responses and fenced JSON are supported. A second invalid response stops the run with an actionable model-configuration message instead of a raw parsing traceback. No provider fallback is implemented.</w:t>
+        <w:t>LLM SDK retries selected transient failures. Discovery and analysis each regenerate once from the original evidence if output is empty, malformed, or fails validation. Text blocks, fenced JSON, and common report wrappers are supported. Unrecognized wrappers and all-unavailable analyses with nonempty evidence are retried instead of being presented as successful empty reports. A second invalid response stops the run with an actionable model-configuration message instead of a raw parsing traceback. No provider fallback is implemented.</w:t>
       </w:r>
     </w:p>
     <w:p>

</xml_diff>

<commit_message>
Bound live research runtime and show provider progress
</commit_message>
<xml_diff>
--- a/PROJECT_ARCHITECTURE.docx
+++ b/PROJECT_ARCHITECTURE.docx
@@ -808,7 +808,7 @@
                 <w:rFonts w:ascii="Courier New" w:hAnsi="Courier New"/>
                 <w:sz w:val="19"/>
               </w:rPr>
-              <w:t>pipeline.py</w:t>
+              <w:t>research_runner.py</w:t>
             </w:r>
             <w:r>
               <w:rPr>
@@ -843,7 +843,7 @@
               <w:rPr>
                 <w:sz w:val="19"/>
               </w:rPr>
-              <w:t>Compile discover → researcher → analyst graph, normalize the queue, stop at zero competitors</w:t>
+              <w:t>Isolate provider work, relay progress, stop the worker after 120 seconds</w:t>
             </w:r>
           </w:p>
         </w:tc>
@@ -884,7 +884,7 @@
                 <w:rFonts w:ascii="Courier New" w:hAnsi="Courier New"/>
                 <w:sz w:val="19"/>
               </w:rPr>
-              <w:t>youcom_client.py</w:t>
+              <w:t>pipeline.py</w:t>
             </w:r>
             <w:r>
               <w:rPr>
@@ -919,7 +919,7 @@
               <w:rPr>
                 <w:sz w:val="19"/>
               </w:rPr>
-              <w:t>POST Search API requests, select web/news sections, retain snippets and dates, filter URLs, execute two searches concurrently</w:t>
+              <w:t>Compile discover → researcher → analyst graph, normalize the queue, stop at zero competitors</w:t>
             </w:r>
           </w:p>
         </w:tc>
@@ -960,7 +960,7 @@
                 <w:rFonts w:ascii="Courier New" w:hAnsi="Courier New"/>
                 <w:sz w:val="19"/>
               </w:rPr>
-              <w:t>analyst.py</w:t>
+              <w:t>youcom_client.py</w:t>
             </w:r>
             <w:r>
               <w:rPr>
@@ -995,7 +995,7 @@
               <w:rPr>
                 <w:sz w:val="19"/>
               </w:rPr>
-              <w:t>Extract names, request report JSON, normalize with Pydantic, restrict source URLs to supplied evidence</w:t>
+              <w:t>POST Search API requests, select web/news sections, retain snippets and dates, filter URLs, execute two searches concurrently</w:t>
             </w:r>
           </w:p>
         </w:tc>
@@ -1036,7 +1036,7 @@
                 <w:rFonts w:ascii="Courier New" w:hAnsi="Courier New"/>
                 <w:sz w:val="19"/>
               </w:rPr>
-              <w:t>models.py</w:t>
+              <w:t>analyst.py</w:t>
             </w:r>
             <w:r>
               <w:rPr>
@@ -1071,7 +1071,7 @@
               <w:rPr>
                 <w:sz w:val="19"/>
               </w:rPr>
-              <w:t>SearchResult, CompetitorReport, and ResearchState contracts</w:t>
+              <w:t>Extract names, request report JSON, normalize with Pydantic, restrict source URLs to supplied evidence</w:t>
             </w:r>
           </w:p>
         </w:tc>
@@ -1112,7 +1112,7 @@
                 <w:rFonts w:ascii="Courier New" w:hAnsi="Courier New"/>
                 <w:sz w:val="19"/>
               </w:rPr>
-              <w:t>test_pipeline.py</w:t>
+              <w:t>models.py</w:t>
             </w:r>
             <w:r>
               <w:rPr>
@@ -1147,7 +1147,7 @@
               <w:rPr>
                 <w:sz w:val="19"/>
               </w:rPr>
-              <w:t>Offline graph, parser, analyst, HTTP contract, and Streamlit regression tests</w:t>
+              <w:t>SearchResult, CompetitorReport, and ResearchState contracts</w:t>
             </w:r>
           </w:p>
         </w:tc>
@@ -1188,7 +1188,7 @@
                 <w:rFonts w:ascii="Courier New" w:hAnsi="Courier New"/>
                 <w:sz w:val="19"/>
               </w:rPr>
-              <w:t>scripts/check_secrets.py</w:t>
+              <w:t>test_pipeline.py</w:t>
             </w:r>
             <w:r>
               <w:rPr>
@@ -1223,7 +1223,7 @@
               <w:rPr>
                 <w:sz w:val="19"/>
               </w:rPr>
-              <w:t>Pattern-based credential scan of tracked and unignored files</w:t>
+              <w:t>Offline graph, parser, analyst, HTTP contract, and Streamlit regression tests</w:t>
             </w:r>
           </w:p>
         </w:tc>
@@ -1264,6 +1264,82 @@
                 <w:rFonts w:ascii="Courier New" w:hAnsi="Courier New"/>
                 <w:sz w:val="19"/>
               </w:rPr>
+              <w:t>scripts/check_secrets.py</w:t>
+            </w:r>
+            <w:r>
+              <w:rPr>
+                <w:sz w:val="19"/>
+              </w:rPr>
+            </w:r>
+          </w:p>
+        </w:tc>
+        <w:tc>
+          <w:tcPr>
+            <w:tcW w:type="dxa" w:w="6696"/>
+            <w:vAlign w:val="center"/>
+            <w:shd w:fill="F2F5F8"/>
+            <w:tcMar>
+              <w:top w:w="95" w:type="dxa"/>
+              <w:bottom w:w="95" w:type="dxa"/>
+              <w:left w:w="95" w:type="dxa"/>
+              <w:right w:w="95" w:type="dxa"/>
+            </w:tcMar>
+            <w:tcBorders>
+              <w:top w:val="single" w:sz="4" w:color="D9D9D9"/>
+              <w:bottom w:val="single" w:sz="4" w:color="D9D9D9"/>
+              <w:left w:val="single" w:sz="4" w:color="D9D9D9"/>
+              <w:right w:val="single" w:sz="4" w:color="D9D9D9"/>
+            </w:tcBorders>
+          </w:tcPr>
+          <w:p>
+            <w:pPr>
+              <w:spacing w:after="0" w:line="252" w:lineRule="auto"/>
+            </w:pPr>
+            <w:r>
+              <w:rPr>
+                <w:sz w:val="19"/>
+              </w:rPr>
+              <w:t>Pattern-based credential scan of tracked and unignored files</w:t>
+            </w:r>
+          </w:p>
+        </w:tc>
+      </w:tr>
+      <w:tr>
+        <w:trPr>
+          <w:cantSplit/>
+        </w:trPr>
+        <w:tc>
+          <w:tcPr>
+            <w:tcW w:type="dxa" w:w="3096"/>
+            <w:vAlign w:val="center"/>
+            <w:shd w:fill="FFFFFF"/>
+            <w:tcMar>
+              <w:top w:w="95" w:type="dxa"/>
+              <w:bottom w:w="95" w:type="dxa"/>
+              <w:left w:w="95" w:type="dxa"/>
+              <w:right w:w="95" w:type="dxa"/>
+            </w:tcMar>
+            <w:tcBorders>
+              <w:top w:val="single" w:sz="4" w:color="D9D9D9"/>
+              <w:bottom w:val="single" w:sz="4" w:color="D9D9D9"/>
+              <w:left w:val="single" w:sz="4" w:color="D9D9D9"/>
+              <w:right w:val="single" w:sz="4" w:color="D9D9D9"/>
+            </w:tcBorders>
+          </w:tcPr>
+          <w:p>
+            <w:pPr>
+              <w:spacing w:after="0" w:line="252" w:lineRule="auto"/>
+            </w:pPr>
+            <w:r>
+              <w:rPr>
+                <w:sz w:val="19"/>
+              </w:rPr>
+            </w:r>
+            <w:r>
+              <w:rPr>
+                <w:rFonts w:ascii="Courier New" w:hAnsi="Courier New"/>
+                <w:sz w:val="19"/>
+              </w:rPr>
               <w:t>.github/workflows/</w:t>
             </w:r>
             <w:r>
@@ -1277,7 +1353,7 @@
           <w:tcPr>
             <w:tcW w:type="dxa" w:w="6696"/>
             <w:vAlign w:val="center"/>
-            <w:shd w:fill="F2F5F8"/>
+            <w:shd w:fill="FFFFFF"/>
             <w:tcMar>
               <w:top w:w="95" w:type="dxa"/>
               <w:bottom w:w="95" w:type="dxa"/>
@@ -1422,7 +1498,7 @@
         <w:pStyle w:val="ListNumber"/>
       </w:pPr>
       <w:r>
-        <w:t>Streamlit clears the previous snapshot on a new run, validates a nonblank company and API keys, and constructs the search client and analyst.</w:t>
+        <w:t>Streamlit clears the previous snapshot on a new run, validates a nonblank company and API keys, and starts an isolated worker with a 120-second deadline. The worker constructs the search client and analyst and sends stage progress.</w:t>
       </w:r>
     </w:p>
     <w:p>
@@ -1484,7 +1560,7 @@
         <w:pStyle w:val="ListNumber"/>
       </w:pPr>
       <w:r>
-        <w:t>Analysis sends category-labelled evidence, URLs, and available dates to OpenRouter. Empty evidence produces an “Evidence unavailable” report without model invocation. Model JSON is normalized and validated.</w:t>
+        <w:t>Analysis sends category-labelled evidence, URLs, and available dates to OpenRouter. Empty evidence produces an “Evidence unavailable” report without model invocation. Model JSON is normalized and validated. Analysis receives up to four results per category, with 1,500 snippet characters each.</w:t>
       </w:r>
     </w:p>
     <w:p>
@@ -2123,12 +2199,12 @@
         <w:t>ChatOpenAI</w:t>
       </w:r>
       <w:r>
-        <w:t>. The default model identifier is configuration, not a guarantee of provider availability. Search service charges and model limits depend on the account and selected model. The LLM client has an explicit 45-second request timeout and two SDK retries; these do not impose a total workflow deadline.</w:t>
+        <w:t>. The default model identifier is configuration, not a guarantee of provider availability. Search service charges and model limits depend on the account and selected model. The LLM client has a 20-second request timeout, no SDK retries, and a 1,800-token output limit. The UI worker has a separate 120-second wall-clock deadline and is terminated on expiry, with up to two seconds for cleanup.</w:t>
       </w:r>
     </w:p>
     <w:p>
       <w:r>
-        <w:t>Company queries are sent to You.com; company names and retrieved evidence are sent to OpenRouter. Credentials stay in local environment configuration. There is no database, durable checkpoint, email delivery, or background job.</w:t>
+        <w:t>Company queries are sent to You.com; company names and retrieved evidence are sent to OpenRouter. Credentials stay in local environment configuration. There is no database, durable checkpoint, or email delivery. The temporary worker runs only while a research request is active. The runner is tested on macOS and Linux; Windows pipe polling is not supported.</w:t>
       </w:r>
     </w:p>
     <w:p>
@@ -2992,7 +3068,7 @@
         <w:pStyle w:val="ListBullet"/>
       </w:pPr>
       <w:r>
-        <w:t>LLM SDK retries selected transient failures. Discovery and analysis each regenerate once from the original evidence if output is empty, malformed, or fails validation. Text blocks, fenced JSON, and common report wrappers are supported. Unrecognized wrappers and all-unavailable analyses with nonempty evidence are retried instead of being presented as successful empty reports. A second invalid response stops the run with an actionable model-configuration message instead of a raw parsing traceback. No provider fallback is implemented.</w:t>
+        <w:t>LLM transport failures stop immediately without SDK retries. Discovery and analysis each regenerate once from the original evidence if output is empty, malformed, or fails validation. Text blocks, fenced JSON, and common report wrappers are supported. Unrecognized wrappers and all-unavailable analyses with nonempty evidence are retried instead of being presented as successful empty reports. A second invalid response stops the run with an actionable model-configuration message instead of a raw parsing traceback. No provider fallback is implemented.</w:t>
       </w:r>
     </w:p>
     <w:p>
@@ -3008,7 +3084,7 @@
         <w:pStyle w:val="ListBullet"/>
       </w:pPr>
       <w:r>
-        <w:t>The UI shows run-level progress, not streamed node events.</w:t>
+        <w:t>The UI shows discovery, search, and analysis progress as the worker runs.</w:t>
       </w:r>
     </w:p>
     <w:p>
@@ -3032,7 +3108,7 @@
         <w:pStyle w:val="ListBullet"/>
       </w:pPr>
       <w:r>
-        <w:t>No durable evidence archive, observation timestamp, request-ID logging, or full workflow deadline exists. These matter for production auditability.</w:t>
+        <w:t>No durable evidence archive, observation timestamp, or request-ID logging exists. The two-minute deadline applies to the UI runner; direct pipeline calls do not have that process-level deadline.</w:t>
       </w:r>
     </w:p>
     <w:p>

</xml_diff>

<commit_message>
Request structured analysis and recover truncated model output
</commit_message>
<xml_diff>
--- a/PROJECT_ARCHITECTURE.docx
+++ b/PROJECT_ARCHITECTURE.docx
@@ -1514,7 +1514,7 @@
         <w:pStyle w:val="ListNumber"/>
       </w:pPr>
       <w:r>
-        <w:t>OpenRouter extracts up to three company names. Names are trimmed, deduplicated case-insensitively, and filtered to exclude the target. The pipeline also enforces these queue invariants.</w:t>
+        <w:t>OpenRouter returns a schema-constrained object containing a competitors array. Names are trimmed, deduplicated case-insensitively, and filtered to exclude the target. The pipeline also enforces these queue invariants.</w:t>
       </w:r>
     </w:p>
     <w:p>
@@ -1560,7 +1560,7 @@
         <w:pStyle w:val="ListNumber"/>
       </w:pPr>
       <w:r>
-        <w:t>Analysis sends category-labelled evidence, URLs, and available dates to OpenRouter. Empty evidence produces an “Evidence unavailable” report without model invocation. Model JSON is normalized and validated. Analysis receives up to four results per category, with 1,500 snippet characters each.</w:t>
+        <w:t>Analysis sends category-labelled evidence, URLs, and available dates to OpenRouter. Empty evidence produces an “Evidence unavailable” report without model invocation. Model JSON is normalized and validated. Analysis receives up to four results per category, with 1,500 snippet characters each. Requests try a strict JSON schema, then JSON-object mode on HTTP 400, 404, or 422, within the same two-attempt budget. In fallback mode providers may ignore the output-format option; local validation always applies. The worker remembers the fallback mode for subsequent calls in the same run.</w:t>
       </w:r>
     </w:p>
     <w:p>
@@ -2199,7 +2199,7 @@
         <w:t>ChatOpenAI</w:t>
       </w:r>
       <w:r>
-        <w:t>. The default model identifier is configuration, not a guarantee of provider availability. Search service charges and model limits depend on the account and selected model. The LLM client has a 20-second request timeout, no SDK retries, and a 1,800-token output limit. The UI worker has a separate 120-second wall-clock deadline and is terminated on expiry, with up to two seconds for cleanup.</w:t>
+        <w:t>. The default model identifier is configuration, not a guarantee of provider availability. Search service charges and model limits depend on the account and selected model. The LLM client has a 20-second request timeout, no SDK retries, and a 4,096-token initial output limit. A truncation retry can use 8,192 tokens within the existing deadline. The UI worker has a separate 120-second wall-clock deadline and is terminated on expiry, with up to two seconds for cleanup.</w:t>
       </w:r>
     </w:p>
     <w:p>
@@ -3068,7 +3068,7 @@
         <w:pStyle w:val="ListBullet"/>
       </w:pPr>
       <w:r>
-        <w:t>LLM transport failures stop immediately without SDK retries. Discovery and analysis each regenerate once from the original evidence if output is empty, malformed, or fails validation. Text blocks, fenced JSON, and common report wrappers are supported. Unrecognized wrappers and all-unavailable analyses with nonempty evidence are retried instead of being presented as successful empty reports. A second invalid response stops the run with an actionable model-configuration message instead of a raw parsing traceback. No provider fallback is implemented.</w:t>
+        <w:t>LLM transport failures stop immediately without SDK retries. Discovery and analysis each regenerate once from the original evidence if output is empty, malformed, or fails validation. Text blocks, fenced JSON, and common report wrappers are supported. Unrecognized wrappers and all-unavailable analyses with nonempty evidence are retried instead of being presented as successful empty reports. A second invalid response stops the run with an actionable model-configuration message instead of a raw parsing traceback. Truncated output is rejected even if its JSON can be parsed. No application-level provider fallback is implemented.</w:t>
       </w:r>
     </w:p>
     <w:p>

</xml_diff>

<commit_message>
Preserve completed research on timeout and allow smaller runs
</commit_message>
<xml_diff>
--- a/PROJECT_ARCHITECTURE.docx
+++ b/PROJECT_ARCHITECTURE.docx
@@ -1498,7 +1498,7 @@
         <w:pStyle w:val="ListNumber"/>
       </w:pPr>
       <w:r>
-        <w:t>Streamlit clears the previous snapshot on a new run, validates a nonblank company and API keys, and starts an isolated worker with a 120-second deadline. The worker constructs the search client and analyst and sends stage progress.</w:t>
+        <w:t>Streamlit clears the previous snapshot on a new run, validates a nonblank company and API keys, and starts an isolated worker with a 120-second deadline. The UI defaults to one competitor; users can choose up to three. The worker constructs the search client and analyst and sends stage progress.</w:t>
       </w:r>
     </w:p>
     <w:p>
@@ -1514,7 +1514,7 @@
         <w:pStyle w:val="ListNumber"/>
       </w:pPr>
       <w:r>
-        <w:t>OpenRouter returns a schema-constrained object containing a competitors array. Names are trimmed, deduplicated case-insensitively, and filtered to exclude the target. The pipeline also enforces these queue invariants.</w:t>
+        <w:t>OpenRouter returns a schema-constrained object containing a competitors array. Names are trimmed, deduplicated case-insensitively, and filtered to exclude the target. The pipeline also enforces these queue invariants and the selected queue limit.</w:t>
       </w:r>
     </w:p>
     <w:p>
@@ -1584,27 +1584,7 @@
         <w:pStyle w:val="ListNumber"/>
       </w:pPr>
       <w:r>
-        <w:t xml:space="preserve">Streamlit stores the company alongside the reports so editing the input cannot relabel an existing snapshot. A new run clears the old snapshot. JSON download includes </w:t>
-      </w:r>
-      <w:r>
-        <w:rPr>
-          <w:rFonts w:ascii="Courier New" w:hAnsi="Courier New"/>
-          <w:sz w:val="18"/>
-        </w:rPr>
-        <w:t>company</w:t>
-      </w:r>
-      <w:r>
-        <w:t xml:space="preserve"> and an array of serialized </w:t>
-      </w:r>
-      <w:r>
-        <w:rPr>
-          <w:rFonts w:ascii="Courier New" w:hAnsi="Courier New"/>
-          <w:sz w:val="18"/>
-        </w:rPr>
-        <w:t>reports</w:t>
-      </w:r>
-      <w:r>
-        <w:t>.</w:t>
+        <w:t>Streamlit stores the company alongside the reports so editing the input cannot relabel an existing snapshot. A new run clears the old snapshot. Each completed report is relayed to the parent process immediately. JSON download includes company, reports, requested competitor count, partial flag, and status.</w:t>
       </w:r>
     </w:p>
     <w:p>
@@ -3076,7 +3056,7 @@
         <w:pStyle w:val="ListBullet"/>
       </w:pPr>
       <w:r>
-        <w:t>A failure in either search or any competitor aborts the run. Earlier reports from that run are not recovered or shown. Partial-result recovery and category-level failure handling remain future work.</w:t>
+        <w:t>A search or model failure stops further work. The runner preserves completed reports on failure or timeout and labels the result partial in the UI and export. No completed reports means an error. Category-level recovery and resuming unfinished competitors remain future work.</w:t>
       </w:r>
     </w:p>
     <w:p>

</xml_diff>